<commit_message>
Arc wine app freelance: trim resume back to one page
Co-Authored-By: Claude Opus 5.5 <noreply@anthropic.com>
Claude-Session: https://claude.ai/code/session_018DEej5NGjq1omj9BTtvEiy
</commit_message>
<xml_diff>
--- a/applications/arc-ai-wine-app-growth-marketer/Arc-WineApp-GrowthMarketer-Resume.docx
+++ b/applications/arc-ai-wine-app-growth-marketer/Arc-WineApp-GrowthMarketer-Resume.docx
@@ -536,30 +536,6 @@
     </w:p>
     <w:p>
       <w:pPr>
-        <w:spacing w:after="30"/>
-        <w:ind w:left="259" w:hanging="259"/>
-      </w:pPr>
-      <w:r>
-        <w:rPr>
-          <w:rFonts w:ascii="Calibri" w:hAnsi="Calibri"/>
-          <w:b w:val="0"/>
-          <w:i w:val="0"/>
-          <w:color w:val="163A5F"/>
-        </w:rPr>
-        <w:t xml:space="preserve">•  </w:t>
-      </w:r>
-      <w:r>
-        <w:rPr>
-          <w:rFonts w:ascii="Calibri" w:hAnsi="Calibri"/>
-          <w:b w:val="0"/>
-          <w:i w:val="0"/>
-          <w:color w:val="1A1A1A"/>
-        </w:rPr>
-        <w:t>Advised on A/B testing strategy, defining test structure and success criteria.</w:t>
-      </w:r>
-    </w:p>
-    <w:p>
-      <w:pPr>
         <w:spacing w:before="140" w:after="60"/>
         <w:pBdr>
           <w:bottom w:val="single" w:sz="6" w:space="2" w:color="163a5f"/>

</xml_diff>